<commit_message>
Updated with Joe's ideas
</commit_message>
<xml_diff>
--- a/Tasks to tackle with Joe.docx
+++ b/Tasks to tackle with Joe.docx
@@ -4,13 +4,8 @@
   <w:body>
     <w:p>
       <w:r>
-        <w:t xml:space="preserve">Tasks to tackle with </w:t>
-      </w:r>
-      <w:proofErr w:type="gramStart"/>
-      <w:r>
-        <w:t>Joe</w:t>
-      </w:r>
-      <w:proofErr w:type="gramEnd"/>
+        <w:t>Tasks to tackle with Joe</w:t>
+      </w:r>
     </w:p>
     <w:p>
       <w:r>
@@ -26,13 +21,8 @@
         </w:numPr>
       </w:pPr>
       <w:r>
-        <w:t xml:space="preserve">Calculate full dataset difference in mean value for each species </w:t>
-      </w:r>
-      <w:proofErr w:type="gramStart"/>
-      <w:r>
-        <w:t>combination</w:t>
-      </w:r>
-      <w:proofErr w:type="gramEnd"/>
+        <w:t>Calculate full dataset difference in mean value for each species combination</w:t>
+      </w:r>
     </w:p>
     <w:p>
       <w:pPr>
@@ -43,13 +33,8 @@
         </w:numPr>
       </w:pPr>
       <w:r>
-        <w:t xml:space="preserve">Calculate each bootstrap iteration </w:t>
-      </w:r>
-      <w:proofErr w:type="gramStart"/>
-      <w:r>
-        <w:t>differences</w:t>
-      </w:r>
-      <w:proofErr w:type="gramEnd"/>
+        <w:t>Calculate each bootstrap iteration differences</w:t>
+      </w:r>
     </w:p>
     <w:p>
       <w:pPr>
@@ -60,22 +45,12 @@
         </w:numPr>
       </w:pPr>
       <w:r>
-        <w:t xml:space="preserve">Calculate the test </w:t>
-      </w:r>
-      <w:proofErr w:type="gramStart"/>
-      <w:r>
-        <w:t>statistic</w:t>
-      </w:r>
-      <w:proofErr w:type="gramEnd"/>
+        <w:t>Calculate the test statistic</w:t>
+      </w:r>
     </w:p>
     <w:p>
-      <w:proofErr w:type="spellStart"/>
-      <w:r>
-        <w:t>Tcrit</w:t>
-      </w:r>
-      <w:proofErr w:type="spellEnd"/>
-      <w:r>
-        <w:t xml:space="preserve"> through time for 2023 for target 3 species</w:t>
+      <w:r>
+        <w:t>Tcrit through time for 2023 for target 3 species</w:t>
       </w:r>
     </w:p>
     <w:p>
@@ -83,13 +58,94 @@
         <w:t>Maybe compare early v late flushing species</w:t>
       </w:r>
       <w:r>
-        <w:t xml:space="preserve"> to </w:t>
-      </w:r>
-      <w:proofErr w:type="spellStart"/>
-      <w:r>
-        <w:t>Tcrit</w:t>
-      </w:r>
-      <w:proofErr w:type="spellEnd"/>
+        <w:t xml:space="preserve"> to Tcrit</w:t>
+      </w:r>
+    </w:p>
+    <w:p/>
+    <w:p>
+      <w:r>
+        <w:t>Joe’s thoughts</w:t>
+      </w:r>
+    </w:p>
+    <w:p>
+      <w:pPr>
+        <w:pStyle w:val="ListParagraph"/>
+        <w:numPr>
+          <w:ilvl w:val="0"/>
+          <w:numId w:val="2"/>
+        </w:numPr>
+      </w:pPr>
+      <w:r>
+        <w:t xml:space="preserve">Determine what need to </w:t>
+      </w:r>
+      <w:proofErr w:type="gramStart"/>
+      <w:r>
+        <w:t>be done</w:t>
+      </w:r>
+      <w:proofErr w:type="gramEnd"/>
+      <w:r>
+        <w:t xml:space="preserve"> to any outstanding freezing figures</w:t>
+      </w:r>
+    </w:p>
+    <w:p>
+      <w:pPr>
+        <w:pStyle w:val="ListParagraph"/>
+        <w:numPr>
+          <w:ilvl w:val="0"/>
+          <w:numId w:val="2"/>
+        </w:numPr>
+      </w:pPr>
+      <w:r>
+        <w:t>General idea of what heating figures to make</w:t>
+      </w:r>
+    </w:p>
+    <w:p>
+      <w:pPr>
+        <w:pStyle w:val="ListParagraph"/>
+        <w:numPr>
+          <w:ilvl w:val="0"/>
+          <w:numId w:val="2"/>
+        </w:numPr>
+      </w:pPr>
+      <w:r>
+        <w:t>Thesis formatting</w:t>
+      </w:r>
+    </w:p>
+    <w:p>
+      <w:pPr>
+        <w:pStyle w:val="ListParagraph"/>
+        <w:numPr>
+          <w:ilvl w:val="0"/>
+          <w:numId w:val="2"/>
+        </w:numPr>
+      </w:pPr>
+      <w:r>
+        <w:t>Heating manuscript outline review</w:t>
+      </w:r>
+    </w:p>
+    <w:p>
+      <w:pPr>
+        <w:pStyle w:val="ListParagraph"/>
+        <w:numPr>
+          <w:ilvl w:val="0"/>
+          <w:numId w:val="2"/>
+        </w:numPr>
+      </w:pPr>
+      <w:r>
+        <w:t>Thesis presentation outline</w:t>
+      </w:r>
+    </w:p>
+    <w:p>
+      <w:pPr>
+        <w:pStyle w:val="ListParagraph"/>
+        <w:numPr>
+          <w:ilvl w:val="0"/>
+          <w:numId w:val="2"/>
+        </w:numPr>
+      </w:pPr>
+      <w:r>
+        <w:t>Oral defense prep tips</w:t>
+      </w:r>
     </w:p>
     <w:sectPr>
       <w:pgSz w:w="12240" w:h="15840"/>
@@ -104,6 +160,119 @@
 <file path=word/numbering.xml><?xml version="1.0" encoding="utf-8"?>
 <w:numbering xmlns:wpc="http://schemas.microsoft.com/office/word/2010/wordprocessingCanvas" xmlns:cx="http://schemas.microsoft.com/office/drawing/2014/chartex" xmlns:cx1="http://schemas.microsoft.com/office/drawing/2015/9/8/chartex" xmlns:cx2="http://schemas.microsoft.com/office/drawing/2015/10/21/chartex" xmlns:cx3="http://schemas.microsoft.com/office/drawing/2016/5/9/chartex" xmlns:cx4="http://schemas.microsoft.com/office/drawing/2016/5/10/chartex" xmlns:cx5="http://schemas.microsoft.com/office/drawing/2016/5/11/chartex" xmlns:cx6="http://schemas.microsoft.com/office/drawing/2016/5/12/chartex" xmlns:cx7="http://schemas.microsoft.com/office/drawing/2016/5/13/chartex" xmlns:cx8="http://schemas.microsoft.com/office/drawing/2016/5/14/chartex" xmlns:mc="http://schemas.openxmlformats.org/markup-compatibility/2006" xmlns:aink="http://schemas.microsoft.com/office/drawing/2016/ink" xmlns:am3d="http://schemas.microsoft.com/office/drawing/2017/model3d" xmlns:o="urn:schemas-microsoft-com:office:office" xmlns:oel="http://schemas.microsoft.com/office/2019/extlst" xmlns:r="http://schemas.openxmlformats.org/officeDocument/2006/relationships" xmlns:m="http://schemas.openxmlformats.org/officeDocument/2006/math" xmlns:v="urn:schemas-microsoft-com:vml" xmlns:wp14="http://schemas.microsoft.com/office/word/2010/wordprocessingDrawing" xmlns:wp="http://schemas.openxmlformats.org/drawingml/2006/wordprocessingDrawing" xmlns:w10="urn:schemas-microsoft-com:office:word" xmlns:w="http://schemas.openxmlformats.org/wordprocessingml/2006/main" xmlns:w14="http://schemas.microsoft.com/office/word/2010/wordml" xmlns:w15="http://schemas.microsoft.com/office/word/2012/wordml" xmlns:w16cex="http://schemas.microsoft.com/office/word/2018/wordml/cex" xmlns:w16cid="http://schemas.microsoft.com/office/word/2016/wordml/cid" xmlns:w16="http://schemas.microsoft.com/office/word/2018/wordml" xmlns:w16sdtdh="http://schemas.microsoft.com/office/word/2020/wordml/sdtdatahash" xmlns:w16se="http://schemas.microsoft.com/office/word/2015/wordml/symex" xmlns:wpg="http://schemas.microsoft.com/office/word/2010/wordprocessingGroup" xmlns:wpi="http://schemas.microsoft.com/office/word/2010/wordprocessingInk" xmlns:wne="http://schemas.microsoft.com/office/word/2006/wordml" xmlns:wps="http://schemas.microsoft.com/office/word/2010/wordprocessingShape" mc:Ignorable="w14 w15 w16se w16cid w16 w16cex w16sdtdh wp14">
   <w:abstractNum w:abstractNumId="0" w15:restartNumberingAfterBreak="0">
+    <w:nsid w:val="3F862D2D"/>
+    <w:multiLevelType w:val="hybridMultilevel"/>
+    <w:tmpl w:val="84483A8C"/>
+    <w:lvl w:ilvl="0" w:tplc="04090001">
+      <w:start w:val="1"/>
+      <w:numFmt w:val="bullet"/>
+      <w:lvlText w:val=""/>
+      <w:lvlJc w:val="left"/>
+      <w:pPr>
+        <w:ind w:left="720" w:hanging="360"/>
+      </w:pPr>
+      <w:rPr>
+        <w:rFonts w:ascii="Symbol" w:hAnsi="Symbol" w:hint="default"/>
+      </w:rPr>
+    </w:lvl>
+    <w:lvl w:ilvl="1" w:tplc="04090003" w:tentative="1">
+      <w:start w:val="1"/>
+      <w:numFmt w:val="bullet"/>
+      <w:lvlText w:val="o"/>
+      <w:lvlJc w:val="left"/>
+      <w:pPr>
+        <w:ind w:left="1440" w:hanging="360"/>
+      </w:pPr>
+      <w:rPr>
+        <w:rFonts w:ascii="Courier New" w:hAnsi="Courier New" w:hint="default"/>
+      </w:rPr>
+    </w:lvl>
+    <w:lvl w:ilvl="2" w:tplc="04090005" w:tentative="1">
+      <w:start w:val="1"/>
+      <w:numFmt w:val="bullet"/>
+      <w:lvlText w:val=""/>
+      <w:lvlJc w:val="left"/>
+      <w:pPr>
+        <w:ind w:left="2160" w:hanging="360"/>
+      </w:pPr>
+      <w:rPr>
+        <w:rFonts w:ascii="Wingdings" w:hAnsi="Wingdings" w:hint="default"/>
+      </w:rPr>
+    </w:lvl>
+    <w:lvl w:ilvl="3" w:tplc="04090001" w:tentative="1">
+      <w:start w:val="1"/>
+      <w:numFmt w:val="bullet"/>
+      <w:lvlText w:val=""/>
+      <w:lvlJc w:val="left"/>
+      <w:pPr>
+        <w:ind w:left="2880" w:hanging="360"/>
+      </w:pPr>
+      <w:rPr>
+        <w:rFonts w:ascii="Symbol" w:hAnsi="Symbol" w:hint="default"/>
+      </w:rPr>
+    </w:lvl>
+    <w:lvl w:ilvl="4" w:tplc="04090003" w:tentative="1">
+      <w:start w:val="1"/>
+      <w:numFmt w:val="bullet"/>
+      <w:lvlText w:val="o"/>
+      <w:lvlJc w:val="left"/>
+      <w:pPr>
+        <w:ind w:left="3600" w:hanging="360"/>
+      </w:pPr>
+      <w:rPr>
+        <w:rFonts w:ascii="Courier New" w:hAnsi="Courier New" w:hint="default"/>
+      </w:rPr>
+    </w:lvl>
+    <w:lvl w:ilvl="5" w:tplc="04090005" w:tentative="1">
+      <w:start w:val="1"/>
+      <w:numFmt w:val="bullet"/>
+      <w:lvlText w:val=""/>
+      <w:lvlJc w:val="left"/>
+      <w:pPr>
+        <w:ind w:left="4320" w:hanging="360"/>
+      </w:pPr>
+      <w:rPr>
+        <w:rFonts w:ascii="Wingdings" w:hAnsi="Wingdings" w:hint="default"/>
+      </w:rPr>
+    </w:lvl>
+    <w:lvl w:ilvl="6" w:tplc="04090001" w:tentative="1">
+      <w:start w:val="1"/>
+      <w:numFmt w:val="bullet"/>
+      <w:lvlText w:val=""/>
+      <w:lvlJc w:val="left"/>
+      <w:pPr>
+        <w:ind w:left="5040" w:hanging="360"/>
+      </w:pPr>
+      <w:rPr>
+        <w:rFonts w:ascii="Symbol" w:hAnsi="Symbol" w:hint="default"/>
+      </w:rPr>
+    </w:lvl>
+    <w:lvl w:ilvl="7" w:tplc="04090003" w:tentative="1">
+      <w:start w:val="1"/>
+      <w:numFmt w:val="bullet"/>
+      <w:lvlText w:val="o"/>
+      <w:lvlJc w:val="left"/>
+      <w:pPr>
+        <w:ind w:left="5760" w:hanging="360"/>
+      </w:pPr>
+      <w:rPr>
+        <w:rFonts w:ascii="Courier New" w:hAnsi="Courier New" w:hint="default"/>
+      </w:rPr>
+    </w:lvl>
+    <w:lvl w:ilvl="8" w:tplc="04090005" w:tentative="1">
+      <w:start w:val="1"/>
+      <w:numFmt w:val="bullet"/>
+      <w:lvlText w:val=""/>
+      <w:lvlJc w:val="left"/>
+      <w:pPr>
+        <w:ind w:left="6480" w:hanging="360"/>
+      </w:pPr>
+      <w:rPr>
+        <w:rFonts w:ascii="Wingdings" w:hAnsi="Wingdings" w:hint="default"/>
+      </w:rPr>
+    </w:lvl>
+  </w:abstractNum>
+  <w:abstractNum w:abstractNumId="1" w15:restartNumberingAfterBreak="0">
     <w:nsid w:val="67416890"/>
     <w:multiLevelType w:val="hybridMultilevel"/>
     <w:tmpl w:val="80805370"/>
@@ -193,6 +362,9 @@
     </w:lvl>
   </w:abstractNum>
   <w:num w:numId="1" w16cid:durableId="1943761515">
+    <w:abstractNumId w:val="1"/>
+  </w:num>
+  <w:num w:numId="2" w16cid:durableId="1225221134">
     <w:abstractNumId w:val="0"/>
   </w:num>
 </w:numbering>
@@ -936,23 +1108,6 @@
 </file>
 
 <file path=customXml/item1.xml><?xml version="1.0" encoding="utf-8"?>
-<p:properties xmlns:p="http://schemas.microsoft.com/office/2006/metadata/properties" xmlns:xsi="http://www.w3.org/2001/XMLSchema-instance" xmlns:pc="http://schemas.microsoft.com/office/infopath/2007/PartnerControls">
-  <documentManagement>
-    <_activity xmlns="285064df-b23e-4074-9307-63c9505ad36d" xsi:nil="true"/>
-  </documentManagement>
-</p:properties>
-</file>
-
-<file path=customXml/item2.xml><?xml version="1.0" encoding="utf-8"?>
-<?mso-contentType ?>
-<FormTemplates xmlns="http://schemas.microsoft.com/sharepoint/v3/contenttype/forms">
-  <Display>DocumentLibraryForm</Display>
-  <Edit>DocumentLibraryForm</Edit>
-  <New>DocumentLibraryForm</New>
-</FormTemplates>
-</file>
-
-<file path=customXml/item3.xml><?xml version="1.0" encoding="utf-8"?>
 <ct:contentTypeSchema xmlns:ct="http://schemas.microsoft.com/office/2006/metadata/contentType" xmlns:ma="http://schemas.microsoft.com/office/2006/metadata/properties/metaAttributes" ct:_="" ma:_="" ma:contentTypeName="Document" ma:contentTypeID="0x01010015B06BB43E4F0A43A95E91B88D6BE6D6" ma:contentTypeVersion="7" ma:contentTypeDescription="Create a new document." ma:contentTypeScope="" ma:versionID="9678c871eddf9a2b5c0beba31c411a23">
   <xsd:schema xmlns:xsd="http://www.w3.org/2001/XMLSchema" xmlns:xs="http://www.w3.org/2001/XMLSchema" xmlns:p="http://schemas.microsoft.com/office/2006/metadata/properties" xmlns:ns3="285064df-b23e-4074-9307-63c9505ad36d" xmlns:ns4="1d6ca8f9-2eea-4608-a526-210137efbd06" targetNamespace="http://schemas.microsoft.com/office/2006/metadata/properties" ma:root="true" ma:fieldsID="51ad23718a5b0dfbf46ac38bc9a7397b" ns3:_="" ns4:_="">
     <xsd:import namespace="285064df-b23e-4074-9307-63c9505ad36d"/>
@@ -1135,32 +1290,24 @@
 </ct:contentTypeSchema>
 </file>
 
-<file path=customXml/itemProps1.xml><?xml version="1.0" encoding="utf-8"?>
-<ds:datastoreItem xmlns:ds="http://schemas.openxmlformats.org/officeDocument/2006/customXml" ds:itemID="{FD12E595-E186-40F2-9A28-03FAD271A555}">
-  <ds:schemaRefs>
-    <ds:schemaRef ds:uri="http://schemas.openxmlformats.org/package/2006/metadata/core-properties"/>
-    <ds:schemaRef ds:uri="http://purl.org/dc/terms/"/>
-    <ds:schemaRef ds:uri="http://purl.org/dc/elements/1.1/"/>
-    <ds:schemaRef ds:uri="http://schemas.microsoft.com/office/2006/documentManagement/types"/>
-    <ds:schemaRef ds:uri="1d6ca8f9-2eea-4608-a526-210137efbd06"/>
-    <ds:schemaRef ds:uri="http://www.w3.org/XML/1998/namespace"/>
-    <ds:schemaRef ds:uri="http://schemas.microsoft.com/office/infopath/2007/PartnerControls"/>
-    <ds:schemaRef ds:uri="http://schemas.microsoft.com/office/2006/metadata/properties"/>
-    <ds:schemaRef ds:uri="285064df-b23e-4074-9307-63c9505ad36d"/>
-    <ds:schemaRef ds:uri="http://purl.org/dc/dcmitype/"/>
-  </ds:schemaRefs>
-</ds:datastoreItem>
+<file path=customXml/item2.xml><?xml version="1.0" encoding="utf-8"?>
+<?mso-contentType ?>
+<FormTemplates xmlns="http://schemas.microsoft.com/sharepoint/v3/contenttype/forms">
+  <Display>DocumentLibraryForm</Display>
+  <Edit>DocumentLibraryForm</Edit>
+  <New>DocumentLibraryForm</New>
+</FormTemplates>
 </file>
 
-<file path=customXml/itemProps2.xml><?xml version="1.0" encoding="utf-8"?>
-<ds:datastoreItem xmlns:ds="http://schemas.openxmlformats.org/officeDocument/2006/customXml" ds:itemID="{739F349E-3FC6-4164-93AB-AAF85278026D}">
-  <ds:schemaRefs>
-    <ds:schemaRef ds:uri="http://schemas.microsoft.com/sharepoint/v3/contenttype/forms"/>
-  </ds:schemaRefs>
-</ds:datastoreItem>
+<file path=customXml/item3.xml><?xml version="1.0" encoding="utf-8"?>
+<p:properties xmlns:p="http://schemas.microsoft.com/office/2006/metadata/properties" xmlns:xsi="http://www.w3.org/2001/XMLSchema-instance" xmlns:pc="http://schemas.microsoft.com/office/infopath/2007/PartnerControls">
+  <documentManagement>
+    <_activity xmlns="285064df-b23e-4074-9307-63c9505ad36d" xsi:nil="true"/>
+  </documentManagement>
+</p:properties>
 </file>
 
-<file path=customXml/itemProps3.xml><?xml version="1.0" encoding="utf-8"?>
+<file path=customXml/itemProps1.xml><?xml version="1.0" encoding="utf-8"?>
 <ds:datastoreItem xmlns:ds="http://schemas.openxmlformats.org/officeDocument/2006/customXml" ds:itemID="{A8328256-2843-48A7-B122-97CB5D2186BD}">
   <ds:schemaRefs>
     <ds:schemaRef ds:uri="http://schemas.microsoft.com/office/2006/metadata/contentType"/>
@@ -1177,4 +1324,22 @@
     <ds:schemaRef ds:uri="http://schemas.microsoft.com/internal/obd"/>
   </ds:schemaRefs>
 </ds:datastoreItem>
+</file>
+
+<file path=customXml/itemProps2.xml><?xml version="1.0" encoding="utf-8"?>
+<ds:datastoreItem xmlns:ds="http://schemas.openxmlformats.org/officeDocument/2006/customXml" ds:itemID="{739F349E-3FC6-4164-93AB-AAF85278026D}">
+  <ds:schemaRefs>
+    <ds:schemaRef ds:uri="http://schemas.microsoft.com/sharepoint/v3/contenttype/forms"/>
+  </ds:schemaRefs>
+</ds:datastoreItem>
+</file>
+
+<file path=customXml/itemProps3.xml><?xml version="1.0" encoding="utf-8"?>
+<ds:datastoreItem xmlns:ds="http://schemas.openxmlformats.org/officeDocument/2006/customXml" ds:itemID="{FD12E595-E186-40F2-9A28-03FAD271A555}">
+  <ds:schemaRefs>
+    <ds:schemaRef ds:uri="http://schemas.microsoft.com/office/2006/metadata/properties"/>
+    <ds:schemaRef ds:uri="http://schemas.microsoft.com/office/infopath/2007/PartnerControls"/>
+    <ds:schemaRef ds:uri="285064df-b23e-4074-9307-63c9505ad36d"/>
+  </ds:schemaRefs>
+</ds:datastoreItem>
 </file>
</xml_diff>